<commit_message>
Title the current role Digital Experience Designer and reorder Team Lead bullets
Co-Authored-By: Claude Fable 5 <noreply@anthropic.com>
</commit_message>
<xml_diff>
--- a/Resume_Christin_Gilbert.docx
+++ b/Resume_Christin_Gilbert.docx
@@ -172,7 +172,7 @@
           <w:sz w:val="23"/>
           <w:szCs w:val="23"/>
         </w:rPr>
-        <w:t xml:space="preserve">Independent Consultant</w:t>
+        <w:t xml:space="preserve">Digital Experience Designer</w:t>
       </w:r>
       <w:r>
         <w:rPr>
@@ -199,23 +199,7 @@
           <w:sz w:val="18"/>
           <w:szCs w:val="18"/>
         </w:rPr>
-        <w:t xml:space="preserve">Vancouver, BC</w:t>
-      </w:r>
-    </w:p>
-    <w:p>
-      <w:pPr>
-        <w:spacing w:after="60"/>
-      </w:pPr>
-      <w:r>
-        <w:rPr>
-          <w:rFonts w:ascii="Calibri" w:cs="Calibri" w:eastAsia="Calibri" w:hAnsi="Calibri"/>
-          <w:i/>
-          <w:iCs/>
-          <w:color w:val="222222"/>
-          <w:sz w:val="21"/>
-          <w:szCs w:val="21"/>
-        </w:rPr>
-        <w:t xml:space="preserve">Product design, digital experiences, content strategy &amp; documentary production</w:t>
+        <w:t xml:space="preserve">Independent Practice · Vancouver, BC</w:t>
       </w:r>
     </w:p>
     <w:p>
@@ -292,25 +276,6 @@
           <w:szCs w:val="21"/>
         </w:rPr>
         <w:t xml:space="preserve">Designing and building the website and booking questionnaire for Himalayan Green Trips, a travel agency in Nepal.</w:t>
-      </w:r>
-    </w:p>
-    <w:p>
-      <w:pPr>
-        <w:pStyle w:val="ListParagraph"/>
-        <w:numPr>
-          <w:ilvl w:val="0"/>
-          <w:numId w:val="2"/>
-        </w:numPr>
-        <w:spacing w:after="70"/>
-      </w:pPr>
-      <w:r>
-        <w:rPr>
-          <w:rFonts w:ascii="Calibri" w:cs="Calibri" w:eastAsia="Calibri" w:hAnsi="Calibri"/>
-          <w:color w:val="222222"/>
-          <w:sz w:val="21"/>
-          <w:szCs w:val="21"/>
-        </w:rPr>
-        <w:t xml:space="preserve">Conducting interviews with 90+ porters in the Himalayas and producing Voice of the Porters, a documentary scheduled for presentation to the Nepal Tourism Board.</w:t>
       </w:r>
     </w:p>
     <w:p>
@@ -373,45 +338,45 @@
           <w:sz w:val="21"/>
           <w:szCs w:val="21"/>
         </w:rPr>
+        <w:t xml:space="preserve">Designed and implemented a modular Digital Visual Style Guide that unified brand standards, accessibility principles and digital design patterns, enabling more consistent execution across platforms and channels.</w:t>
+      </w:r>
+    </w:p>
+    <w:p>
+      <w:pPr>
+        <w:pStyle w:val="ListParagraph"/>
+        <w:numPr>
+          <w:ilvl w:val="0"/>
+          <w:numId w:val="2"/>
+        </w:numPr>
+        <w:spacing w:after="70"/>
+      </w:pPr>
+      <w:r>
+        <w:rPr>
+          <w:rFonts w:ascii="Calibri" w:cs="Calibri" w:eastAsia="Calibri" w:hAnsi="Calibri"/>
+          <w:color w:val="222222"/>
+          <w:sz w:val="21"/>
+          <w:szCs w:val="21"/>
+        </w:rPr>
+        <w:t xml:space="preserve">Developed AI-enabled creative workflows and governance frameworks, training cross-functional teams in image and video production while maintaining brand consistency and quality standards.</w:t>
+      </w:r>
+    </w:p>
+    <w:p>
+      <w:pPr>
+        <w:pStyle w:val="ListParagraph"/>
+        <w:numPr>
+          <w:ilvl w:val="0"/>
+          <w:numId w:val="2"/>
+        </w:numPr>
+        <w:spacing w:after="70"/>
+      </w:pPr>
+      <w:r>
+        <w:rPr>
+          <w:rFonts w:ascii="Calibri" w:cs="Calibri" w:eastAsia="Calibri" w:hAnsi="Calibri"/>
+          <w:color w:val="222222"/>
+          <w:sz w:val="21"/>
+          <w:szCs w:val="21"/>
+        </w:rPr>
         <w:t xml:space="preserve">Led the delivery of digital experiences and campaign content across web, email, social and paid channels, aligning photo and video production, post-production and asset delivery with visual systems and campaign frameworks.</w:t>
-      </w:r>
-    </w:p>
-    <w:p>
-      <w:pPr>
-        <w:pStyle w:val="ListParagraph"/>
-        <w:numPr>
-          <w:ilvl w:val="0"/>
-          <w:numId w:val="2"/>
-        </w:numPr>
-        <w:spacing w:after="70"/>
-      </w:pPr>
-      <w:r>
-        <w:rPr>
-          <w:rFonts w:ascii="Calibri" w:cs="Calibri" w:eastAsia="Calibri" w:hAnsi="Calibri"/>
-          <w:color w:val="222222"/>
-          <w:sz w:val="21"/>
-          <w:szCs w:val="21"/>
-        </w:rPr>
-        <w:t xml:space="preserve">Designed and implemented a modular Digital Visual Style Guide that unified brand standards, accessibility principles and digital design patterns, enabling more consistent execution across platforms and channels.</w:t>
-      </w:r>
-    </w:p>
-    <w:p>
-      <w:pPr>
-        <w:pStyle w:val="ListParagraph"/>
-        <w:numPr>
-          <w:ilvl w:val="0"/>
-          <w:numId w:val="2"/>
-        </w:numPr>
-        <w:spacing w:after="70"/>
-      </w:pPr>
-      <w:r>
-        <w:rPr>
-          <w:rFonts w:ascii="Calibri" w:cs="Calibri" w:eastAsia="Calibri" w:hAnsi="Calibri"/>
-          <w:color w:val="222222"/>
-          <w:sz w:val="21"/>
-          <w:szCs w:val="21"/>
-        </w:rPr>
-        <w:t xml:space="preserve">Developed AI-enabled creative workflows and governance frameworks, training cross-functional teams in image and video production while maintaining brand consistency and quality standards.</w:t>
       </w:r>
     </w:p>
     <w:p>

</xml_diff>

<commit_message>
Name the promotion in the summary and restore Senior to the current role
Co-Authored-By: Claude Fable 5 <noreply@anthropic.com>
</commit_message>
<xml_diff>
--- a/Resume_Christin_Gilbert.docx
+++ b/Resume_Christin_Gilbert.docx
@@ -95,7 +95,7 @@
           <w:sz w:val="21"/>
           <w:szCs w:val="21"/>
         </w:rPr>
-        <w:t xml:space="preserve">15 years of experience in interface design, backed by cognitive neuropsychology. I’ve designed digital experiences, design systems and the workflows behind them. My work has grown from individual interfaces to looking more broadly at how content and systems can make space for different ways of thinking.</w:t>
+        <w:t xml:space="preserve">15 years of experience in interface design, backed by cognitive neuropsychology. I’ve designed digital experiences, design systems and the workflows behind them. At Éminence Organics I was promoted to Digital Creative Team Lead, setting the visual standards, building the structure for asset organization and bringing AI-assisted workflows into daily production. My work has grown to look more broadly at how content and systems can make space for different ways of thinking.</w:t>
       </w:r>
     </w:p>
     <w:p>
@@ -172,7 +172,7 @@
           <w:sz w:val="23"/>
           <w:szCs w:val="23"/>
         </w:rPr>
-        <w:t xml:space="preserve">Digital Experience Designer</w:t>
+        <w:t xml:space="preserve">Senior Digital Experience Designer</w:t>
       </w:r>
       <w:r>
         <w:rPr>

</xml_diff>